<commit_message>
Update: to instruction guide
</commit_message>
<xml_diff>
--- a/docs/ShowItAll_0925.docx
+++ b/docs/ShowItAll_0925.docx
@@ -217,13 +217,10 @@
         </w:numPr>
       </w:pPr>
       <w:r>
-        <w:t xml:space="preserve">Switch states </w:t>
-      </w:r>
-      <w:r>
-        <w:t xml:space="preserve"> </w:t>
-      </w:r>
-      <w:r>
-        <w:t>SA - SH</w:t>
+        <w:t>Physical s</w:t>
+      </w:r>
+      <w:r>
+        <w:t>witch states</w:t>
       </w:r>
     </w:p>
     <w:p>
@@ -463,9 +460,17 @@
         <w:t>Filename and labels (</w:t>
       </w:r>
       <w:r>
-        <w:t>TX15, GX15, TX16S Mk 3</w:t>
-      </w:r>
-      <w:r>
+        <w:rPr>
+          <w:i/>
+          <w:iCs/>
+        </w:rPr>
+        <w:t>tx’s with screen height &gt;=320 px</w:t>
+      </w:r>
+      <w:r>
+        <w:rPr>
+          <w:i/>
+          <w:iCs/>
+        </w:rPr>
         <w:t xml:space="preserve"> only</w:t>
       </w:r>
       <w:r>
@@ -528,19 +533,22 @@
         </w:numPr>
       </w:pPr>
       <w:r>
-        <w:t>T</w:t>
-      </w:r>
-      <w:r>
-        <w:t>ransmitter</w:t>
-      </w:r>
-      <w:r>
-        <w:t xml:space="preserve"> with colour </w:t>
-      </w:r>
-      <w:r>
-        <w:t xml:space="preserve">displays </w:t>
-      </w:r>
-      <w:r>
-        <w:t xml:space="preserve">of width </w:t>
+        <w:t>C</w:t>
+      </w:r>
+      <w:r>
+        <w:t xml:space="preserve">olour </w:t>
+      </w:r>
+      <w:r>
+        <w:t>screen</w:t>
+      </w:r>
+      <w:r>
+        <w:t xml:space="preserve"> </w:t>
+      </w:r>
+      <w:r>
+        <w:t xml:space="preserve">with </w:t>
+      </w:r>
+      <w:r>
+        <w:t xml:space="preserve">width </w:t>
       </w:r>
       <w:r>
         <w:t xml:space="preserve">320, </w:t>
@@ -602,13 +610,7 @@
         <w:t>does not meet the</w:t>
       </w:r>
       <w:r>
-        <w:t xml:space="preserve"> </w:t>
-      </w:r>
-      <w:r>
-        <w:t xml:space="preserve">above </w:t>
-      </w:r>
-      <w:r>
-        <w:t>requirements</w:t>
+        <w:t xml:space="preserve"> requirements</w:t>
       </w:r>
       <w:r>
         <w:t>, an error message is displayed.</w:t>
@@ -904,39 +906,73 @@
         <w:t>’</w:t>
       </w:r>
       <w:r>
-        <w:t xml:space="preserve"> alert</w:t>
-      </w:r>
-      <w:r>
-        <w:t xml:space="preserve"> (optional, for advanced users)</w:t>
-      </w:r>
-    </w:p>
-    <w:p>
-      <w:r>
-        <w:t xml:space="preserve">If you have an electric model, you can </w:t>
-      </w:r>
-      <w:r>
-        <w:t xml:space="preserve">have </w:t>
-      </w:r>
-      <w:r>
-        <w:t xml:space="preserve">a </w:t>
+        <w:t xml:space="preserve"> </w:t>
+      </w:r>
+      <w:r>
+        <w:t>warning</w:t>
+      </w:r>
+      <w:r>
+        <w:t xml:space="preserve"> (</w:t>
+      </w:r>
+      <w:r>
+        <w:rPr>
+          <w:i/>
+          <w:iCs/>
+        </w:rPr>
+        <w:t>optional, for advanced users</w:t>
+      </w:r>
+      <w:r>
+        <w:t>)</w:t>
+      </w:r>
+    </w:p>
+    <w:p>
+      <w:r>
+        <w:t>A</w:t>
+      </w:r>
+      <w:r>
+        <w:t xml:space="preserve"> </w:t>
       </w:r>
       <w:r>
         <w:t xml:space="preserve">flashing </w:t>
       </w:r>
       <w:r>
-        <w:t>‘motor armed’ alert</w:t>
-      </w:r>
-      <w:r>
-        <w:t xml:space="preserve"> when your motor is armed </w:t>
-      </w:r>
-      <w:r>
-        <w:t xml:space="preserve">(note this is the armed state of the motor in the EdgeTX setup, not the ELRS </w:t>
+        <w:t xml:space="preserve">‘motor armed’ </w:t>
+      </w:r>
+      <w:r>
+        <w:t xml:space="preserve">warning </w:t>
+      </w:r>
+      <w:r>
+        <w:t>can be configured for electric models</w:t>
+      </w:r>
+      <w:r>
+        <w:t xml:space="preserve">. </w:t>
+      </w:r>
+      <w:r>
+        <w:rPr>
+          <w:i/>
+          <w:iCs/>
+        </w:rPr>
+        <w:t>N</w:t>
+      </w:r>
+      <w:r>
+        <w:rPr>
+          <w:i/>
+          <w:iCs/>
+        </w:rPr>
+        <w:t>ote</w:t>
+      </w:r>
+      <w:r>
+        <w:rPr>
+          <w:i/>
+          <w:iCs/>
+        </w:rPr>
+        <w:t>:</w:t>
+      </w:r>
+      <w:r>
+        <w:t xml:space="preserve"> this is the armed state of the motor in the EdgeTX setup, not the ELRS </w:t>
       </w:r>
       <w:r>
         <w:t>armed state</w:t>
-      </w:r>
-      <w:r>
-        <w:t>)</w:t>
       </w:r>
       <w:r>
         <w:t>.</w:t>
@@ -1370,7 +1406,7 @@
     <w:p/>
     <w:p>
       <w:r>
-        <w:t>9</w:t>
+        <w:t>21</w:t>
       </w:r>
       <w:r>
         <w:t xml:space="preserve"> </w:t>

</xml_diff>